<commit_message>
Add MA02 Management Attestation to scope evidence and space evidence references
- Restore the Management Attestation email (Frank Puentes, 08/18/2026) as
  MA02 in 01_Management_Attestation_In-Scope_Applications and cite it under
  Applications in Scope Identified for all 10 samples (attached signed
  attestation section 2 lists the 13 in-scope applications).
- Separate every evidence reference with a blank line on the testing tab,
  Evidence Map and WP Summary; space the observations in column Q.
- Widen testing columns so the application rows fit on screen.
- Evidence Index, removal log, README, zip and Word guide updated.

Co-Authored-By: Claude Opus 5.5 <noreply@anthropic.com>
Claude-Session: https://claude.ai/code/session_01884Wo9yAWN5dtHStWCWnty
</commit_message>
<xml_diff>
--- a/BSI.IT.6.C7_Data_Integrity_DR_Step-by-Step_Testing_and_User_Guide.docx
+++ b/BSI.IT.6.C7_Data_Integrity_DR_Step-by-Step_Testing_and_User_Guide.docx
@@ -3300,7 +3300,7 @@
         <w:rPr>
           <w:rFonts w:ascii="Arial" w:cs="Arial" w:eastAsia="Arial" w:hAnsi="Arial"/>
         </w:rPr>
-        <w:t xml:space="preserve">The testing cells contain long wrapped text. To read a full cell, click it and read the formula bar (expand it with Ctrl+Shift+U), or increase the row height.</w:t>
+        <w:t xml:space="preserve">The testing cells contain long wrapped text with a blank line between evidence references. Columns are widened so each application row fits on screen; the T24 row (36 records) is taller than Excel allows – click a cell and read the formula bar (expand with Ctrl+Shift+U), or use the Evidence Map tab.</w:t>
       </w:r>
     </w:p>
     <w:p>
@@ -3966,7 +3966,7 @@
                 <w:sz w:val="17"/>
                 <w:szCs w:val="17"/>
               </w:rPr>
-              <w:t xml:space="preserve">Every evidence file: reference, file name, folder location, original name, type, date/owner, content, samples and columns supported. Below it (row 35 onward): the log of redundant files removed.</w:t>
+              <w:t xml:space="preserve">Every evidence file: reference, file name, folder location, original name, type, date/owner, content, samples and columns supported. Below it (row 36 onward): the log of redundant files removed.</w:t>
             </w:r>
           </w:p>
         </w:tc>
@@ -4728,7 +4728,7 @@
                 <w:sz w:val="17"/>
                 <w:szCs w:val="17"/>
               </w:rPr>
-              <w:t xml:space="preserve">53–66</w:t>
+              <w:t xml:space="preserve">53–67</w:t>
             </w:r>
           </w:p>
         </w:tc>
@@ -4788,7 +4788,7 @@
                 <w:sz w:val="17"/>
                 <w:szCs w:val="17"/>
               </w:rPr>
-              <w:t xml:space="preserve">What MA01 and E01–E16b show and which columns they support.</w:t>
+              <w:t xml:space="preserve">What MA01, MA02 and E01–E16b show and which columns they support.</w:t>
             </w:r>
           </w:p>
         </w:tc>
@@ -4821,7 +4821,7 @@
                 <w:sz w:val="17"/>
                 <w:szCs w:val="17"/>
               </w:rPr>
-              <w:t xml:space="preserve">68–78</w:t>
+              <w:t xml:space="preserve">69–79</w:t>
             </w:r>
           </w:p>
         </w:tc>
@@ -4914,7 +4914,7 @@
                 <w:sz w:val="17"/>
                 <w:szCs w:val="17"/>
               </w:rPr>
-              <w:t xml:space="preserve">80–81</w:t>
+              <w:t xml:space="preserve">81–82</w:t>
             </w:r>
           </w:p>
         </w:tc>
@@ -6588,7 +6588,7 @@
         <w:rPr>
           <w:rFonts w:ascii="Arial" w:cs="Arial" w:eastAsia="Arial" w:hAnsi="Arial"/>
         </w:rPr>
-        <w:t xml:space="preserve"> – one line per evidence file in the form </w:t>
+        <w:t xml:space="preserve"> – one line per evidence file, separated by a blank line for readability, in the form </w:t>
       </w:r>
       <w:r>
         <w:rPr>
@@ -7346,7 +7346,7 @@
                 <w:sz w:val="17"/>
                 <w:szCs w:val="17"/>
               </w:rPr>
-              <w:t xml:space="preserve">Rows 68–78 (amber)</w:t>
+              <w:t xml:space="preserve">Rows 69–79 (amber)</w:t>
             </w:r>
           </w:p>
         </w:tc>
@@ -7882,7 +7882,7 @@
                 <w:sz w:val="17"/>
                 <w:szCs w:val="17"/>
               </w:rPr>
-              <w:t xml:space="preserve">1</w:t>
+              <w:t xml:space="preserve">2</w:t>
             </w:r>
           </w:p>
         </w:tc>
@@ -7942,7 +7942,7 @@
                 <w:sz w:val="17"/>
                 <w:szCs w:val="17"/>
               </w:rPr>
-              <w:t xml:space="preserve">MA01 – BCiC screenshot "BSI In-Scope Applications-2026"</w:t>
+              <w:t xml:space="preserve">MA01 – BCiC screenshot "BSI In-Scope Applications-2026"; MA02 – Management Attestation email (Frank Puentes 08/18/2026) with signed attestation listing the 13 in-scope applications</w:t>
             </w:r>
           </w:p>
         </w:tc>
@@ -9291,7 +9291,7 @@
         <w:rPr>
           <w:rFonts w:ascii="Arial" w:cs="Arial" w:eastAsia="Arial" w:hAnsi="Arial"/>
         </w:rPr>
-        <w:t xml:space="preserve">The evidence packages received contained the same information more than once (byte-identical files, the same email saved twice, and attachment copies). Each was removed so every item appears once. The full log is on the Evidence Index tab (row 35 onward) and in README.md; the retained file carries identical content.</w:t>
+        <w:t xml:space="preserve">The evidence packages received contained the same information more than once (byte-identical files, the same email saved twice, and attachment copies). Each was removed so every item appears once. The full log is on the Evidence Index tab (row 36 onward) and in README.md; the retained file carries identical content.</w:t>
       </w:r>
     </w:p>
     <w:tbl>
@@ -9414,99 +9414,6 @@
                 <w:szCs w:val="17"/>
               </w:rPr>
               <w:t xml:space="preserve">Reason</w:t>
-            </w:r>
-          </w:p>
-        </w:tc>
-      </w:tr>
-      <w:tr>
-        <w:tc>
-          <w:tcPr>
-            <w:tcW w:type="dxa" w:w="2000"/>
-            <w:tcBorders>
-              <w:top w:val="single" w:color="BFBFBF" w:sz="4"/>
-              <w:left w:val="single" w:color="BFBFBF" w:sz="4"/>
-              <w:bottom w:val="single" w:color="BFBFBF" w:sz="4"/>
-              <w:right w:val="single" w:color="BFBFBF" w:sz="4"/>
-            </w:tcBorders>
-            <w:shd w:fill="F2F2F2" w:color="auto" w:val="clear"/>
-            <w:tcMar>
-              <w:top w:type="dxa" w:w="60"/>
-              <w:left w:type="dxa" w:w="100"/>
-              <w:bottom w:type="dxa" w:w="60"/>
-              <w:right w:type="dxa" w:w="100"/>
-            </w:tcMar>
-          </w:tcPr>
-          <w:p>
-            <w:pPr>
-              <w:spacing w:after="40"/>
-            </w:pPr>
-            <w:r>
-              <w:rPr>
-                <w:rFonts w:ascii="Arial" w:cs="Arial" w:eastAsia="Arial" w:hAnsi="Arial"/>
-                <w:sz w:val="17"/>
-                <w:szCs w:val="17"/>
-              </w:rPr>
-              <w:t xml:space="preserve">MA02</w:t>
-            </w:r>
-          </w:p>
-        </w:tc>
-        <w:tc>
-          <w:tcPr>
-            <w:tcW w:type="dxa" w:w="1300"/>
-            <w:tcBorders>
-              <w:top w:val="single" w:color="BFBFBF" w:sz="4"/>
-              <w:left w:val="single" w:color="BFBFBF" w:sz="4"/>
-              <w:bottom w:val="single" w:color="BFBFBF" w:sz="4"/>
-              <w:right w:val="single" w:color="BFBFBF" w:sz="4"/>
-            </w:tcBorders>
-            <w:tcMar>
-              <w:top w:type="dxa" w:w="60"/>
-              <w:left w:type="dxa" w:w="100"/>
-              <w:bottom w:type="dxa" w:w="60"/>
-              <w:right w:type="dxa" w:w="100"/>
-            </w:tcMar>
-          </w:tcPr>
-          <w:p>
-            <w:pPr>
-              <w:spacing w:after="40"/>
-            </w:pPr>
-            <w:r>
-              <w:rPr>
-                <w:rFonts w:ascii="Arial" w:cs="Arial" w:eastAsia="Arial" w:hAnsi="Arial"/>
-                <w:sz w:val="17"/>
-                <w:szCs w:val="17"/>
-              </w:rPr>
-              <w:t xml:space="preserve">DMA03</w:t>
-            </w:r>
-          </w:p>
-        </w:tc>
-        <w:tc>
-          <w:tcPr>
-            <w:tcW w:type="dxa" w:w="6060"/>
-            <w:tcBorders>
-              <w:top w:val="single" w:color="BFBFBF" w:sz="4"/>
-              <w:left w:val="single" w:color="BFBFBF" w:sz="4"/>
-              <w:bottom w:val="single" w:color="BFBFBF" w:sz="4"/>
-              <w:right w:val="single" w:color="BFBFBF" w:sz="4"/>
-            </w:tcBorders>
-            <w:tcMar>
-              <w:top w:type="dxa" w:w="60"/>
-              <w:left w:type="dxa" w:w="100"/>
-              <w:bottom w:type="dxa" w:w="60"/>
-              <w:right w:type="dxa" w:w="100"/>
-            </w:tcMar>
-          </w:tcPr>
-          <w:p>
-            <w:pPr>
-              <w:spacing w:after="40"/>
-            </w:pPr>
-            <w:r>
-              <w:rPr>
-                <w:rFonts w:ascii="Arial" w:cs="Arial" w:eastAsia="Arial" w:hAnsi="Arial"/>
-                <w:sz w:val="17"/>
-                <w:szCs w:val="17"/>
-              </w:rPr>
-              <w:t xml:space="preserve">same email message (subject, sent 08/18/2026 14:50, attachment 4069_001.pdf)</w:t>
             </w:r>
           </w:p>
         </w:tc>
@@ -17078,6 +16985,36 @@
         <w:rPr>
           <w:rFonts w:ascii="Arial" w:cs="Arial" w:eastAsia="Arial" w:hAnsi="Arial"/>
         </w:rPr>
+        <w:t xml:space="preserve">Open </w:t>
+      </w:r>
+      <w:r>
+        <w:rPr>
+          <w:rFonts w:ascii="Arial" w:cs="Arial" w:eastAsia="Arial" w:hAnsi="Arial"/>
+          <w:b/>
+          <w:bCs/>
+        </w:rPr>
+        <w:t xml:space="preserve">MA02</w:t>
+      </w:r>
+      <w:r>
+        <w:rPr>
+          <w:rFonts w:ascii="Arial" w:cs="Arial" w:eastAsia="Arial" w:hAnsi="Arial"/>
+        </w:rPr>
+        <w:t xml:space="preserve"> (Management_Attestation folder – Management Attestation email, Frank Puentes 08/18/2026), open the attached signed attestation (4069_001.pdf) and confirm §2 lists the application among the 13 in-scope BSI applications that store business data.</w:t>
+      </w:r>
+    </w:p>
+    <w:p>
+      <w:pPr>
+        <w:pStyle w:val="ListParagraph"/>
+        <w:numPr>
+          <w:ilvl w:val="0"/>
+          <w:numId w:val="19"/>
+        </w:numPr>
+        <w:spacing w:after="60" w:line="264"/>
+      </w:pPr>
+      <w:r>
+        <w:rPr>
+          <w:rFonts w:ascii="Arial" w:cs="Arial" w:eastAsia="Arial" w:hAnsi="Arial"/>
+        </w:rPr>
         <w:t xml:space="preserve">Agree to </w:t>
       </w:r>
       <w:r>
@@ -17280,7 +17217,7 @@
                 <w:sz w:val="17"/>
                 <w:szCs w:val="17"/>
               </w:rPr>
-              <w:t xml:space="preserve">MA01 (primary), E01, E02, E05, DMA02, E09.</w:t>
+              <w:t xml:space="preserve">MA01 and MA02 (Management_Attestation folder – primary), E01, E02, E05, DMA02, E09.</w:t>
             </w:r>
           </w:p>
         </w:tc>
@@ -18993,7 +18930,7 @@
                 <w:sz w:val="17"/>
                 <w:szCs w:val="17"/>
               </w:rPr>
-              <w:t xml:space="preserve">E</w:t>
+              <w:t xml:space="preserve">N</w:t>
             </w:r>
           </w:p>
         </w:tc>
@@ -19023,7 +18960,7 @@
                 <w:sz w:val="17"/>
                 <w:szCs w:val="17"/>
               </w:rPr>
-              <w:t xml:space="preserve">Andreina De Stefano</w:t>
+              <w:t xml:space="preserve">PASS – in scope</w:t>
             </w:r>
           </w:p>
         </w:tc>
@@ -19053,7 +18990,7 @@
                 <w:sz w:val="17"/>
                 <w:szCs w:val="17"/>
               </w:rPr>
-              <w:t xml:space="preserve">04 › E03 row 47; 02 › BLA01</w:t>
+              <w:t xml:space="preserve">01 › MA01; 01 › MA02 (open attached 4069_001.pdf, §2)</w:t>
             </w:r>
           </w:p>
         </w:tc>
@@ -19083,7 +19020,7 @@
                 <w:sz w:val="17"/>
                 <w:szCs w:val="17"/>
               </w:rPr>
-              <w:t xml:space="preserve">Business Tester Andreina De Stefano; BLA01 operator Raimy Ayala (observation)</w:t>
+              <w:t xml:space="preserve">App ID 1822 selected in BCiC; ACH Express listed among the 13 in-scope applications in the signed attestation</w:t>
             </w:r>
           </w:p>
         </w:tc>
@@ -19116,7 +19053,7 @@
                 <w:sz w:val="17"/>
                 <w:szCs w:val="17"/>
               </w:rPr>
-              <w:t xml:space="preserve">F</w:t>
+              <w:t xml:space="preserve">E</w:t>
             </w:r>
           </w:p>
         </w:tc>
@@ -19146,7 +19083,7 @@
                 <w:sz w:val="17"/>
                 <w:szCs w:val="17"/>
               </w:rPr>
-              <w:t xml:space="preserve">11/15/2025 – Y / Y / Y</w:t>
+              <w:t xml:space="preserve">Andreina De Stefano</w:t>
             </w:r>
           </w:p>
         </w:tc>
@@ -19176,7 +19113,7 @@
                 <w:sz w:val="17"/>
                 <w:szCs w:val="17"/>
               </w:rPr>
-              <w:t xml:space="preserve">04 › E03 row 47; E16b row 48; 02 › BLA01 p.1 and p.5</w:t>
+              <w:t xml:space="preserve">04 › E03 row 47; 02 › BLA01</w:t>
             </w:r>
           </w:p>
         </w:tc>
@@ -19206,7 +19143,7 @@
                 <w:sz w:val="17"/>
                 <w:szCs w:val="17"/>
               </w:rPr>
-              <w:t xml:space="preserve">Y/N Format, Headers, Content = Y; "No data discrepancy found"; ACH import to ACH Express screenshot</w:t>
+              <w:t xml:space="preserve">Business Tester Andreina De Stefano; BLA01 operator Raimy Ayala (observation)</w:t>
             </w:r>
           </w:p>
         </w:tc>
@@ -19239,7 +19176,7 @@
                 <w:sz w:val="17"/>
                 <w:szCs w:val="17"/>
               </w:rPr>
-              <w:t xml:space="preserve">G</w:t>
+              <w:t xml:space="preserve">F</w:t>
             </w:r>
           </w:p>
         </w:tc>
@@ -19269,7 +19206,7 @@
                 <w:sz w:val="17"/>
                 <w:szCs w:val="17"/>
               </w:rPr>
-              <w:t xml:space="preserve">Claudia Romero</w:t>
+              <w:t xml:space="preserve">11/15/2025 – Y / Y / Y</w:t>
             </w:r>
           </w:p>
         </w:tc>
@@ -19299,7 +19236,7 @@
                 <w:sz w:val="17"/>
                 <w:szCs w:val="17"/>
               </w:rPr>
-              <w:t xml:space="preserve">04 › E03 row 47</w:t>
+              <w:t xml:space="preserve">04 › E03 row 47; E16b row 48; 02 › BLA01 p.1 and p.5</w:t>
             </w:r>
           </w:p>
         </w:tc>
@@ -19329,7 +19266,7 @@
                 <w:sz w:val="17"/>
                 <w:szCs w:val="17"/>
               </w:rPr>
-              <w:t xml:space="preserve">Department Manager Claudia Romero</w:t>
+              <w:t xml:space="preserve">Y/N Format, Headers, Content = Y; "No data discrepancy found"; ACH import to ACH Express screenshot</w:t>
             </w:r>
           </w:p>
         </w:tc>
@@ -19362,7 +19299,7 @@
                 <w:sz w:val="17"/>
                 <w:szCs w:val="17"/>
               </w:rPr>
-              <w:t xml:space="preserve">H</w:t>
+              <w:t xml:space="preserve">G</w:t>
             </w:r>
           </w:p>
         </w:tc>
@@ -19392,7 +19329,7 @@
                 <w:sz w:val="17"/>
                 <w:szCs w:val="17"/>
               </w:rPr>
-              <w:t xml:space="preserve">BCiC approval 05/05/2026</w:t>
+              <w:t xml:space="preserve">Claudia Romero</w:t>
             </w:r>
           </w:p>
         </w:tc>
@@ -19422,7 +19359,7 @@
                 <w:sz w:val="17"/>
                 <w:szCs w:val="17"/>
               </w:rPr>
-              <w:t xml:space="preserve">04 › E03 row 47; 04 › E09</w:t>
+              <w:t xml:space="preserve">04 › E03 row 47</w:t>
             </w:r>
           </w:p>
         </w:tc>
@@ -19452,7 +19389,7 @@
                 <w:sz w:val="17"/>
                 <w:szCs w:val="17"/>
               </w:rPr>
-              <w:t xml:space="preserve">Approval Date 05/05/2026, Attestation Date 08/18/2026; E09 "Approved." 05/05/2026</w:t>
+              <w:t xml:space="preserve">Department Manager Claudia Romero</w:t>
             </w:r>
           </w:p>
         </w:tc>
@@ -19485,7 +19422,7 @@
                 <w:sz w:val="17"/>
                 <w:szCs w:val="17"/>
               </w:rPr>
-              <w:t xml:space="preserve">I</w:t>
+              <w:t xml:space="preserve">H</w:t>
             </w:r>
           </w:p>
         </w:tc>
@@ -19515,7 +19452,7 @@
                 <w:sz w:val="17"/>
                 <w:szCs w:val="17"/>
               </w:rPr>
-              <w:t xml:space="preserve">FED Inclearing (ACH &amp; Cash Letters) ACH Express DIV Procedure</w:t>
+              <w:t xml:space="preserve">BCiC approval 05/05/2026</w:t>
             </w:r>
           </w:p>
         </w:tc>
@@ -19545,7 +19482,7 @@
                 <w:sz w:val="17"/>
                 <w:szCs w:val="17"/>
               </w:rPr>
-              <w:t xml:space="preserve">04 › E03 row 47; 02 › BLA01 p.1</w:t>
+              <w:t xml:space="preserve">04 › E03 row 47; 04 › E09</w:t>
             </w:r>
           </w:p>
         </w:tc>
@@ -19575,7 +19512,7 @@
                 <w:sz w:val="17"/>
                 <w:szCs w:val="17"/>
               </w:rPr>
-              <w:t xml:space="preserve">Procedure name; DIV section with instructions and questions</w:t>
+              <w:t xml:space="preserve">Approval Date 05/05/2026, Attestation Date 08/18/2026; E09 "Approved." 05/05/2026</w:t>
             </w:r>
           </w:p>
         </w:tc>
@@ -19608,7 +19545,7 @@
                 <w:sz w:val="17"/>
                 <w:szCs w:val="17"/>
               </w:rPr>
-              <w:t xml:space="preserve">J</w:t>
+              <w:t xml:space="preserve">I</w:t>
             </w:r>
           </w:p>
         </w:tc>
@@ -19638,7 +19575,7 @@
                 <w:sz w:val="17"/>
                 <w:szCs w:val="17"/>
               </w:rPr>
-              <w:t xml:space="preserve">E09 and DMA01</w:t>
+              <w:t xml:space="preserve">FED Inclearing (ACH &amp; Cash Letters) ACH Express DIV Procedure</w:t>
             </w:r>
           </w:p>
         </w:tc>
@@ -19668,7 +19605,7 @@
                 <w:sz w:val="17"/>
                 <w:szCs w:val="17"/>
               </w:rPr>
-              <w:t xml:space="preserve">04 › E09; 03 › DMA01 (open attached PDF)</w:t>
+              <w:t xml:space="preserve">04 › E03 row 47; 02 › BLA01 p.1</w:t>
             </w:r>
           </w:p>
         </w:tc>
@@ -19698,7 +19635,7 @@
                 <w:sz w:val="17"/>
                 <w:szCs w:val="17"/>
               </w:rPr>
-              <w:t xml:space="preserve">Claudia Romero "Approved." 05/05/2026; signed attestation 08/18/2026</w:t>
+              <w:t xml:space="preserve">Procedure name; DIV section with instructions and questions</w:t>
             </w:r>
           </w:p>
         </w:tc>
@@ -19731,7 +19668,7 @@
                 <w:sz w:val="17"/>
                 <w:szCs w:val="17"/>
               </w:rPr>
-              <w:t xml:space="preserve">K</w:t>
+              <w:t xml:space="preserve">J</w:t>
             </w:r>
           </w:p>
         </w:tc>
@@ -19761,7 +19698,7 @@
                 <w:sz w:val="17"/>
                 <w:szCs w:val="17"/>
               </w:rPr>
-              <w:t xml:space="preserve">Valid</w:t>
+              <w:t xml:space="preserve">E09 and DMA01</w:t>
             </w:r>
           </w:p>
         </w:tc>
@@ -19791,7 +19728,7 @@
                 <w:sz w:val="17"/>
                 <w:szCs w:val="17"/>
               </w:rPr>
-              <w:t xml:space="preserve">04 › E03, E16b, E04, E01, E02; 01 › MA01</w:t>
+              <w:t xml:space="preserve">04 › E09; 03 › DMA01 (open attached PDF)</w:t>
             </w:r>
           </w:p>
         </w:tc>
@@ -19821,7 +19758,7 @@
                 <w:sz w:val="17"/>
                 <w:szCs w:val="17"/>
               </w:rPr>
-              <w:t xml:space="preserve">DIV record and scope flags in BCiC</w:t>
+              <w:t xml:space="preserve">Claudia Romero "Approved." 05/05/2026; signed attestation 08/18/2026</w:t>
             </w:r>
           </w:p>
         </w:tc>
@@ -19854,6 +19791,129 @@
                 <w:sz w:val="17"/>
                 <w:szCs w:val="17"/>
               </w:rPr>
+              <w:t xml:space="preserve">K</w:t>
+            </w:r>
+          </w:p>
+        </w:tc>
+        <w:tc>
+          <w:tcPr>
+            <w:tcW w:type="dxa" w:w="2200"/>
+            <w:tcBorders>
+              <w:top w:val="single" w:color="BFBFBF" w:sz="4"/>
+              <w:left w:val="single" w:color="BFBFBF" w:sz="4"/>
+              <w:bottom w:val="single" w:color="BFBFBF" w:sz="4"/>
+              <w:right w:val="single" w:color="BFBFBF" w:sz="4"/>
+            </w:tcBorders>
+            <w:tcMar>
+              <w:top w:type="dxa" w:w="60"/>
+              <w:left w:type="dxa" w:w="100"/>
+              <w:bottom w:type="dxa" w:w="60"/>
+              <w:right w:type="dxa" w:w="100"/>
+            </w:tcMar>
+          </w:tcPr>
+          <w:p>
+            <w:pPr>
+              <w:spacing w:after="40"/>
+            </w:pPr>
+            <w:r>
+              <w:rPr>
+                <w:rFonts w:ascii="Arial" w:cs="Arial" w:eastAsia="Arial" w:hAnsi="Arial"/>
+                <w:sz w:val="17"/>
+                <w:szCs w:val="17"/>
+              </w:rPr>
+              <w:t xml:space="preserve">Valid</w:t>
+            </w:r>
+          </w:p>
+        </w:tc>
+        <w:tc>
+          <w:tcPr>
+            <w:tcW w:type="dxa" w:w="2800"/>
+            <w:tcBorders>
+              <w:top w:val="single" w:color="BFBFBF" w:sz="4"/>
+              <w:left w:val="single" w:color="BFBFBF" w:sz="4"/>
+              <w:bottom w:val="single" w:color="BFBFBF" w:sz="4"/>
+              <w:right w:val="single" w:color="BFBFBF" w:sz="4"/>
+            </w:tcBorders>
+            <w:tcMar>
+              <w:top w:type="dxa" w:w="60"/>
+              <w:left w:type="dxa" w:w="100"/>
+              <w:bottom w:type="dxa" w:w="60"/>
+              <w:right w:type="dxa" w:w="100"/>
+            </w:tcMar>
+          </w:tcPr>
+          <w:p>
+            <w:pPr>
+              <w:spacing w:after="40"/>
+            </w:pPr>
+            <w:r>
+              <w:rPr>
+                <w:rFonts w:ascii="Arial" w:cs="Arial" w:eastAsia="Arial" w:hAnsi="Arial"/>
+                <w:sz w:val="17"/>
+                <w:szCs w:val="17"/>
+              </w:rPr>
+              <w:t xml:space="preserve">04 › E03, E16b, E04, E01, E02; 01 › MA01</w:t>
+            </w:r>
+          </w:p>
+        </w:tc>
+        <w:tc>
+          <w:tcPr>
+            <w:tcW w:type="dxa" w:w="3560"/>
+            <w:tcBorders>
+              <w:top w:val="single" w:color="BFBFBF" w:sz="4"/>
+              <w:left w:val="single" w:color="BFBFBF" w:sz="4"/>
+              <w:bottom w:val="single" w:color="BFBFBF" w:sz="4"/>
+              <w:right w:val="single" w:color="BFBFBF" w:sz="4"/>
+            </w:tcBorders>
+            <w:tcMar>
+              <w:top w:type="dxa" w:w="60"/>
+              <w:left w:type="dxa" w:w="100"/>
+              <w:bottom w:type="dxa" w:w="60"/>
+              <w:right w:type="dxa" w:w="100"/>
+            </w:tcMar>
+          </w:tcPr>
+          <w:p>
+            <w:pPr>
+              <w:spacing w:after="40"/>
+            </w:pPr>
+            <w:r>
+              <w:rPr>
+                <w:rFonts w:ascii="Arial" w:cs="Arial" w:eastAsia="Arial" w:hAnsi="Arial"/>
+                <w:sz w:val="17"/>
+                <w:szCs w:val="17"/>
+              </w:rPr>
+              <w:t xml:space="preserve">DIV record and scope flags in BCiC</w:t>
+            </w:r>
+          </w:p>
+        </w:tc>
+      </w:tr>
+      <w:tr>
+        <w:tc>
+          <w:tcPr>
+            <w:tcW w:type="dxa" w:w="800"/>
+            <w:tcBorders>
+              <w:top w:val="single" w:color="BFBFBF" w:sz="4"/>
+              <w:left w:val="single" w:color="BFBFBF" w:sz="4"/>
+              <w:bottom w:val="single" w:color="BFBFBF" w:sz="4"/>
+              <w:right w:val="single" w:color="BFBFBF" w:sz="4"/>
+            </w:tcBorders>
+            <w:shd w:fill="F2F2F2" w:color="auto" w:val="clear"/>
+            <w:tcMar>
+              <w:top w:type="dxa" w:w="60"/>
+              <w:left w:type="dxa" w:w="100"/>
+              <w:bottom w:type="dxa" w:w="60"/>
+              <w:right w:type="dxa" w:w="100"/>
+            </w:tcMar>
+          </w:tcPr>
+          <w:p>
+            <w:pPr>
+              <w:spacing w:after="40"/>
+            </w:pPr>
+            <w:r>
+              <w:rPr>
+                <w:rFonts w:ascii="Arial" w:cs="Arial" w:eastAsia="Arial" w:hAnsi="Arial"/>
+                <w:sz w:val="17"/>
+                <w:szCs w:val="17"/>
+              </w:rPr>
               <w:t xml:space="preserve">L–P</w:t>
             </w:r>
           </w:p>
@@ -19944,7 +20004,7 @@
                 <w:sz w:val="17"/>
                 <w:szCs w:val="17"/>
               </w:rPr>
-              <w:t xml:space="preserve">All five attributes met</w:t>
+              <w:t xml:space="preserve">All five attributes met (N shown separately above)</w:t>
             </w:r>
           </w:p>
         </w:tc>
@@ -24231,6 +24291,129 @@
                 <w:szCs w:val="17"/>
               </w:rPr>
               <w:t xml:space="preserve">BC in the Cloud 'Applications In Scope for DR Test BSI' view (filter Scope Entity = BSI; 43 items). The 10 tested applications are selected (1822, 1867, 1868, 1903, 1917, 1937, 1936, 3301, 3299, 4052) and each shows 2025 DR Test Scope = True, 2025 Backup/Restore Test Scope = True and 2025 Backup/Restore DIV Scope = True.</w:t>
+            </w:r>
+          </w:p>
+        </w:tc>
+      </w:tr>
+      <w:tr>
+        <w:tc>
+          <w:tcPr>
+            <w:tcW w:type="dxa" w:w="900"/>
+            <w:tcBorders>
+              <w:top w:val="single" w:color="BFBFBF" w:sz="4"/>
+              <w:left w:val="single" w:color="BFBFBF" w:sz="4"/>
+              <w:bottom w:val="single" w:color="BFBFBF" w:sz="4"/>
+              <w:right w:val="single" w:color="BFBFBF" w:sz="4"/>
+            </w:tcBorders>
+            <w:shd w:fill="F2F2F2" w:color="auto" w:val="clear"/>
+            <w:tcMar>
+              <w:top w:type="dxa" w:w="60"/>
+              <w:left w:type="dxa" w:w="100"/>
+              <w:bottom w:type="dxa" w:w="60"/>
+              <w:right w:type="dxa" w:w="100"/>
+            </w:tcMar>
+          </w:tcPr>
+          <w:p>
+            <w:pPr>
+              <w:spacing w:after="40"/>
+            </w:pPr>
+            <w:r>
+              <w:rPr>
+                <w:rFonts w:ascii="Arial" w:cs="Arial" w:eastAsia="Arial" w:hAnsi="Arial"/>
+                <w:sz w:val="17"/>
+                <w:szCs w:val="17"/>
+              </w:rPr>
+              <w:t xml:space="preserve">MA02</w:t>
+            </w:r>
+          </w:p>
+        </w:tc>
+        <w:tc>
+          <w:tcPr>
+            <w:tcW w:type="dxa" w:w="800"/>
+            <w:tcBorders>
+              <w:top w:val="single" w:color="BFBFBF" w:sz="4"/>
+              <w:left w:val="single" w:color="BFBFBF" w:sz="4"/>
+              <w:bottom w:val="single" w:color="BFBFBF" w:sz="4"/>
+              <w:right w:val="single" w:color="BFBFBF" w:sz="4"/>
+            </w:tcBorders>
+            <w:tcMar>
+              <w:top w:type="dxa" w:w="60"/>
+              <w:left w:type="dxa" w:w="100"/>
+              <w:bottom w:type="dxa" w:w="60"/>
+              <w:right w:type="dxa" w:w="100"/>
+            </w:tcMar>
+          </w:tcPr>
+          <w:p>
+            <w:pPr>
+              <w:spacing w:after="40"/>
+            </w:pPr>
+            <w:r>
+              <w:rPr>
+                <w:rFonts w:ascii="Arial" w:cs="Arial" w:eastAsia="Arial" w:hAnsi="Arial"/>
+                <w:sz w:val="17"/>
+                <w:szCs w:val="17"/>
+              </w:rPr>
+              <w:t xml:space="preserve">01</w:t>
+            </w:r>
+          </w:p>
+        </w:tc>
+        <w:tc>
+          <w:tcPr>
+            <w:tcW w:type="dxa" w:w="2300"/>
+            <w:tcBorders>
+              <w:top w:val="single" w:color="BFBFBF" w:sz="4"/>
+              <w:left w:val="single" w:color="BFBFBF" w:sz="4"/>
+              <w:bottom w:val="single" w:color="BFBFBF" w:sz="4"/>
+              <w:right w:val="single" w:color="BFBFBF" w:sz="4"/>
+            </w:tcBorders>
+            <w:tcMar>
+              <w:top w:type="dxa" w:w="60"/>
+              <w:left w:type="dxa" w:w="100"/>
+              <w:bottom w:type="dxa" w:w="60"/>
+              <w:right w:type="dxa" w:w="100"/>
+            </w:tcMar>
+          </w:tcPr>
+          <w:p>
+            <w:pPr>
+              <w:spacing w:after="40"/>
+            </w:pPr>
+            <w:r>
+              <w:rPr>
+                <w:rFonts w:ascii="Arial" w:cs="Arial" w:eastAsia="Arial" w:hAnsi="Arial"/>
+                <w:sz w:val="17"/>
+                <w:szCs w:val="17"/>
+              </w:rPr>
+              <w:t xml:space="preserve">08/18/2026 – Frank Puentes</w:t>
+            </w:r>
+          </w:p>
+        </w:tc>
+        <w:tc>
+          <w:tcPr>
+            <w:tcW w:type="dxa" w:w="5360"/>
+            <w:tcBorders>
+              <w:top w:val="single" w:color="BFBFBF" w:sz="4"/>
+              <w:left w:val="single" w:color="BFBFBF" w:sz="4"/>
+              <w:bottom w:val="single" w:color="BFBFBF" w:sz="4"/>
+              <w:right w:val="single" w:color="BFBFBF" w:sz="4"/>
+            </w:tcBorders>
+            <w:tcMar>
+              <w:top w:type="dxa" w:w="60"/>
+              <w:left w:type="dxa" w:w="100"/>
+              <w:bottom w:type="dxa" w:w="60"/>
+              <w:right w:type="dxa" w:w="100"/>
+            </w:tcMar>
+          </w:tcPr>
+          <w:p>
+            <w:pPr>
+              <w:spacing w:after="40"/>
+            </w:pPr>
+            <w:r>
+              <w:rPr>
+                <w:rFonts w:ascii="Arial" w:cs="Arial" w:eastAsia="Arial" w:hAnsi="Arial"/>
+                <w:sz w:val="17"/>
+                <w:szCs w:val="17"/>
+              </w:rPr>
+              <w:t xml:space="preserve">Management Attestation email: Frank Puentes (Executive Director, Payments &amp; Cash Management) returns the signed attestation (attachment 4069_001.pdf) to Cesar Vidal. The quoted Cesar Vidal request (08/17/2026) confirms the DR exercises of 11/15/2025 and 02/21/2026 and attaches the BCiC DIV export; the signed attestation §2 lists the 13 in-scope BSI applications that store business data, including all 10 tested applications. Filed in the Management_Attestation folder as received; the same message is also filed as DMA03 for the business line approval attribute.</w:t>
             </w:r>
           </w:p>
         </w:tc>

</xml_diff>